<commit_message>
Publish current competition project, decision diagnostics, map fixes and reading list
</commit_message>
<xml_diff>
--- a/参赛材料/独立表单/诚信承诺书.docx
+++ b/参赛材料/独立表单/诚信承诺书.docx
@@ -14,10 +14,10 @@
       </w:pPr>
       <w:r>
         <w:rPr>
-          <w:rFonts w:ascii="宋体" w:hAnsi="宋体" w:eastAsia="宋体"/>
+          <w:rFonts w:ascii="仿宋" w:hAnsi="仿宋" w:eastAsia="仿宋"/>
           <w:b/>
           <w:color w:val="000000"/>
-          <w:sz w:val="28"/>
+          <w:sz w:val="24"/>
         </w:rPr>
         <w:t>中国仿真创新应用大赛诚信承诺书</w:t>
       </w:r>
@@ -27,7 +27,7 @@
         <w:keepNext w:val="0"/>
         <w:widowControl/>
         <w:spacing w:line="300" w:lineRule="auto" w:before="0" w:after="100"/>
-        <w:ind w:left="0" w:right="0" w:firstLine="560"/>
+        <w:ind w:left="0" w:right="0" w:firstLine="480"/>
         <w:snapToGrid w:val="0"/>
         <w:jc w:val="both"/>
       </w:pPr>
@@ -36,7 +36,7 @@
           <w:rFonts w:ascii="仿宋" w:hAnsi="仿宋" w:eastAsia="仿宋"/>
           <w:b w:val="0"/>
           <w:color w:val="000000"/>
-          <w:sz w:val="28"/>
+          <w:sz w:val="24"/>
         </w:rPr>
         <w:t>参赛成员：________________，自愿参加中国仿真创新应用大赛，为确保大赛的公平、公正、公开，维护参赛诚信和竞赛秩序，郑重承诺：</w:t>
       </w:r>
@@ -46,7 +46,7 @@
         <w:keepNext w:val="0"/>
         <w:widowControl/>
         <w:spacing w:line="300" w:lineRule="auto" w:before="0" w:after="100"/>
-        <w:ind w:left="0" w:right="0" w:firstLine="560"/>
+        <w:ind w:left="0" w:right="0" w:firstLine="480"/>
         <w:snapToGrid w:val="0"/>
         <w:jc w:val="both"/>
       </w:pPr>
@@ -55,7 +55,7 @@
           <w:rFonts w:ascii="仿宋" w:hAnsi="仿宋" w:eastAsia="仿宋"/>
           <w:b w:val="0"/>
           <w:color w:val="000000"/>
-          <w:sz w:val="28"/>
+          <w:sz w:val="24"/>
         </w:rPr>
         <w:t>1、参赛作品（包括但不限于设计方案、作品模型、程序代码、报告文档等）均为本人（团队）独立完成，不抄袭、剽窃他人成果，不侵犯他人知识产权；若引用他人成果或公开资料，将明确标注来源并遵守相关引用规范。</w:t>
       </w:r>
@@ -65,7 +65,7 @@
         <w:keepNext w:val="0"/>
         <w:widowControl/>
         <w:spacing w:line="300" w:lineRule="auto" w:before="0" w:after="100"/>
-        <w:ind w:left="0" w:right="0" w:firstLine="560"/>
+        <w:ind w:left="0" w:right="0" w:firstLine="480"/>
         <w:snapToGrid w:val="0"/>
         <w:jc w:val="both"/>
       </w:pPr>
@@ -74,7 +74,7 @@
           <w:rFonts w:ascii="仿宋" w:hAnsi="仿宋" w:eastAsia="仿宋"/>
           <w:b w:val="0"/>
           <w:color w:val="000000"/>
-          <w:sz w:val="28"/>
+          <w:sz w:val="24"/>
         </w:rPr>
         <w:t>2、不通过代做、买卖等非正当手段获取参赛作品，保证作品的原创性与创新性。</w:t>
       </w:r>
@@ -84,7 +84,7 @@
         <w:keepNext w:val="0"/>
         <w:widowControl/>
         <w:spacing w:line="300" w:lineRule="auto" w:before="0" w:after="100"/>
-        <w:ind w:left="0" w:right="0" w:firstLine="560"/>
+        <w:ind w:left="0" w:right="0" w:firstLine="480"/>
         <w:snapToGrid w:val="0"/>
         <w:jc w:val="both"/>
       </w:pPr>
@@ -93,7 +93,7 @@
           <w:rFonts w:ascii="仿宋" w:hAnsi="仿宋" w:eastAsia="仿宋"/>
           <w:b w:val="0"/>
           <w:color w:val="000000"/>
-          <w:sz w:val="28"/>
+          <w:sz w:val="24"/>
         </w:rPr>
         <w:t>3、严格遵守大赛章程及组委会的各项规定，服从赛事安排和管理；不参与任何形式的作弊、串通评审或其他有损竞赛公平的行为。</w:t>
       </w:r>
@@ -103,7 +103,7 @@
         <w:keepNext w:val="0"/>
         <w:widowControl/>
         <w:spacing w:line="300" w:lineRule="auto" w:before="0" w:after="100"/>
-        <w:ind w:left="0" w:right="0" w:firstLine="560"/>
+        <w:ind w:left="0" w:right="0" w:firstLine="480"/>
         <w:snapToGrid w:val="0"/>
         <w:jc w:val="both"/>
       </w:pPr>
@@ -112,7 +112,7 @@
           <w:rFonts w:ascii="仿宋" w:hAnsi="仿宋" w:eastAsia="仿宋"/>
           <w:b w:val="0"/>
           <w:color w:val="000000"/>
-          <w:sz w:val="28"/>
+          <w:sz w:val="24"/>
         </w:rPr>
         <w:t>4、如若提交作品为往届迭代作品，确保作品更新至少30%的内容，且在作品信息表中说明迭代部分并提供证明材料。</w:t>
       </w:r>
@@ -122,7 +122,7 @@
         <w:keepNext w:val="0"/>
         <w:widowControl/>
         <w:spacing w:line="300" w:lineRule="auto" w:before="0" w:after="100"/>
-        <w:ind w:left="0" w:right="0" w:firstLine="560"/>
+        <w:ind w:left="0" w:right="0" w:firstLine="480"/>
         <w:snapToGrid w:val="0"/>
         <w:jc w:val="both"/>
       </w:pPr>
@@ -131,7 +131,7 @@
           <w:rFonts w:ascii="仿宋" w:hAnsi="仿宋" w:eastAsia="仿宋"/>
           <w:b w:val="0"/>
           <w:color w:val="000000"/>
-          <w:sz w:val="28"/>
+          <w:sz w:val="24"/>
         </w:rPr>
         <w:t>如违反上述承诺，本人（团队）自愿接受大赛组委会的处理，包括但不限于取消参赛资格、收回奖项、通报批评等，并承担由此引发的一切法律责任。</w:t>
       </w:r>
@@ -150,7 +150,7 @@
           <w:rFonts w:ascii="仿宋" w:hAnsi="仿宋" w:eastAsia="仿宋"/>
           <w:b w:val="0"/>
           <w:color w:val="000000"/>
-          <w:sz w:val="28"/>
+          <w:sz w:val="24"/>
         </w:rPr>
         <w:t>团队成员（签字）：</w:t>
         <w:br/>
@@ -174,7 +174,7 @@
           <w:rFonts w:ascii="仿宋" w:hAnsi="仿宋" w:eastAsia="仿宋"/>
           <w:b w:val="0"/>
           <w:color w:val="000000"/>
-          <w:sz w:val="28"/>
+          <w:sz w:val="24"/>
         </w:rPr>
         <w:t>年        月        日</w:t>
       </w:r>
@@ -184,7 +184,7 @@
         <w:keepNext w:val="0"/>
         <w:widowControl/>
         <w:spacing w:line="300" w:lineRule="auto" w:before="0" w:after="100"/>
-        <w:ind w:left="0" w:right="0" w:firstLine="560"/>
+        <w:ind w:left="0" w:right="0" w:firstLine="480"/>
         <w:snapToGrid w:val="0"/>
         <w:jc w:val="both"/>
       </w:pPr>
@@ -193,7 +193,7 @@
           <w:rFonts w:ascii="仿宋" w:hAnsi="仿宋" w:eastAsia="仿宋"/>
           <w:b w:val="0"/>
           <w:color w:val="000000"/>
-          <w:sz w:val="28"/>
+          <w:sz w:val="24"/>
         </w:rPr>
         <w:t>（注意事项：签字部分需为手写，扫描后上传pdf版本；团队参赛需所有成员签字；承诺书需与参赛作品一并提交；请务必如实填写。）</w:t>
       </w:r>
@@ -668,7 +668,7 @@
       <w:rFonts w:ascii="仿宋" w:hAnsi="仿宋" w:eastAsia="仿宋" w:cs="Times New Roman"/>
       <w:color w:val="000000"/>
       <w:kern w:val="2"/>
-      <w:sz w:val="28"/>
+      <w:sz w:val="24"/>
       <w:szCs w:val="22"/>
       <w:lang w:val="en-US" w:eastAsia="zh-CN" w:bidi="ar-SA"/>
     </w:rPr>
@@ -1144,7 +1144,7 @@
     <w:rPr>
       <w:rFonts w:ascii="仿宋" w:hAnsi="仿宋" w:eastAsia="仿宋"/>
       <w:color w:val="000000"/>
-      <w:sz w:val="28"/>
+      <w:sz w:val="24"/>
     </w:rPr>
   </w:style>
   <w:style w:type="paragraph" w:customStyle="1" w:styleId="FrontMatterHeading">

</xml_diff>